<commit_message>
feat: rka api, addendum kontrak api, document export and various updates
</commit_message>
<xml_diff>
--- a/storage/app/templates/ringkasan_kontrak_template.docx
+++ b/storage/app/templates/ringkasan_kontrak_template.docx
@@ -36,1176 +36,8 @@
         </w:rPr>
       </w:pPr>
     </w:p>
-    <w:tbl>
-      <w:tblPr>
-        <w:tblW w:w="0" w:type="auto"/>
-        <w:tblInd w:w="893" w:type="dxa"/>
-        <w:tblLayout w:type="fixed"/>
-        <w:tblCellMar>
-          <w:left w:w="0" w:type="dxa"/>
-          <w:right w:w="0" w:type="dxa"/>
-        </w:tblCellMar>
-        <w:tblLook w:val="01E0" w:firstRow="1" w:lastRow="1" w:firstColumn="1" w:lastColumn="1" w:noHBand="0" w:noVBand="0"/>
-      </w:tblPr>
-      <w:tblGrid>
-        <w:gridCol w:w="2484"/>
-        <w:gridCol w:w="1502"/>
-        <w:gridCol w:w="1488"/>
-      </w:tblGrid>
-      <w:tr>
-        <w:trPr>
-          <w:trHeight w:val="1115"/>
-        </w:trPr>
-        <w:tc>
-          <w:tcPr>
-            <w:tcW w:w="2484" w:type="dxa"/>
-          </w:tcPr>
-          <w:p>
-            <w:pPr>
-              <w:pStyle w:val="TableParagraph"/>
-              <w:spacing w:line="162" w:lineRule="exact"/>
-              <w:rPr>
-                <w:rFonts w:ascii="Times New Roman"/>
-                <w:sz w:val="15"/>
-              </w:rPr>
-            </w:pPr>
-            <w:r>
-              <w:rPr>
-                <w:rFonts w:ascii="Times New Roman"/>
-                <w:sz w:val="15"/>
-              </w:rPr>
-              <w:t>Kegiatan</w:t>
-            </w:r>
-            <w:r>
-              <w:rPr>
-                <w:rFonts w:ascii="Times New Roman"/>
-                <w:spacing w:val="4"/>
-                <w:sz w:val="15"/>
-              </w:rPr>
-              <w:t xml:space="preserve"> </w:t>
-            </w:r>
-            <w:r>
-              <w:rPr>
-                <w:rFonts w:ascii="Times New Roman"/>
-                <w:sz w:val="15"/>
-              </w:rPr>
-              <w:t>yang</w:t>
-            </w:r>
-            <w:r>
-              <w:rPr>
-                <w:rFonts w:ascii="Times New Roman"/>
-                <w:spacing w:val="4"/>
-                <w:sz w:val="15"/>
-              </w:rPr>
-              <w:t xml:space="preserve"> </w:t>
-            </w:r>
-            <w:r>
-              <w:rPr>
-                <w:rFonts w:ascii="Times New Roman"/>
-                <w:sz w:val="15"/>
-              </w:rPr>
-              <w:t>dananya</w:t>
-            </w:r>
-            <w:r>
-              <w:rPr>
-                <w:rFonts w:ascii="Times New Roman"/>
-                <w:spacing w:val="5"/>
-                <w:sz w:val="15"/>
-              </w:rPr>
-              <w:t xml:space="preserve"> </w:t>
-            </w:r>
-            <w:r>
-              <w:rPr>
-                <w:rFonts w:ascii="Times New Roman"/>
-                <w:sz w:val="15"/>
-              </w:rPr>
-              <w:t>berasal</w:t>
-            </w:r>
-            <w:r>
-              <w:rPr>
-                <w:rFonts w:ascii="Times New Roman"/>
-                <w:spacing w:val="4"/>
-                <w:sz w:val="15"/>
-              </w:rPr>
-              <w:t xml:space="preserve"> </w:t>
-            </w:r>
-            <w:r>
-              <w:rPr>
-                <w:rFonts w:ascii="Times New Roman"/>
-                <w:spacing w:val="-4"/>
-                <w:sz w:val="15"/>
-              </w:rPr>
-              <w:t>dari</w:t>
-            </w:r>
-          </w:p>
-          <w:p>
-            <w:pPr>
-              <w:pStyle w:val="TableParagraph"/>
-              <w:spacing w:line="166" w:lineRule="exact"/>
-              <w:ind w:right="130"/>
-              <w:jc w:val="right"/>
-              <w:rPr>
-                <w:sz w:val="15"/>
-              </w:rPr>
-            </w:pPr>
-            <w:r>
-              <w:rPr>
-                <w:noProof/>
-                <w:sz w:val="15"/>
-              </w:rPr>
-              <mc:AlternateContent>
-                <mc:Choice Requires="wpg">
-                  <w:drawing>
-                    <wp:anchor distT="0" distB="0" distL="0" distR="0" simplePos="0" relativeHeight="251659264" behindDoc="1" locked="0" layoutInCell="1" allowOverlap="1" wp14:anchorId="7A550AB7" wp14:editId="2B891547">
-                      <wp:simplePos x="0" y="0"/>
-                      <wp:positionH relativeFrom="column">
-                        <wp:posOffset>1517445</wp:posOffset>
-                      </wp:positionH>
-                      <wp:positionV relativeFrom="paragraph">
-                        <wp:posOffset>-55462</wp:posOffset>
-                      </wp:positionV>
-                      <wp:extent cx="116839" cy="116839"/>
-                      <wp:effectExtent l="0" t="0" r="0" b="0"/>
-                      <wp:wrapNone/>
-                      <wp:docPr id="1" name="Group 1"/>
-                      <wp:cNvGraphicFramePr>
-                        <a:graphicFrameLocks xmlns:a="http://schemas.openxmlformats.org/drawingml/2006/main"/>
-                      </wp:cNvGraphicFramePr>
-                      <a:graphic xmlns:a="http://schemas.openxmlformats.org/drawingml/2006/main">
-                        <a:graphicData uri="http://schemas.microsoft.com/office/word/2010/wordprocessingGroup">
-                          <wpg:wgp>
-                            <wpg:cNvGrpSpPr>
-                              <a:grpSpLocks/>
-                            </wpg:cNvGrpSpPr>
-                            <wpg:grpSpPr>
-                              <a:xfrm>
-                                <a:off x="0" y="0"/>
-                                <a:ext cx="116839" cy="116839"/>
-                                <a:chOff x="0" y="0"/>
-                                <a:chExt cx="116839" cy="116839"/>
-                              </a:xfrm>
-                            </wpg:grpSpPr>
-                            <pic:pic xmlns:pic="http://schemas.openxmlformats.org/drawingml/2006/picture">
-                              <pic:nvPicPr>
-                                <pic:cNvPr id="2" name="Image 2"/>
-                                <pic:cNvPicPr/>
-                              </pic:nvPicPr>
-                              <pic:blipFill>
-                                <a:blip r:embed="rId5" cstate="print"/>
-                                <a:stretch>
-                                  <a:fillRect/>
-                                </a:stretch>
-                              </pic:blipFill>
-                              <pic:spPr>
-                                <a:xfrm>
-                                  <a:off x="0" y="0"/>
-                                  <a:ext cx="116586" cy="116585"/>
-                                </a:xfrm>
-                                <a:prstGeom prst="rect">
-                                  <a:avLst/>
-                                </a:prstGeom>
-                              </pic:spPr>
-                            </pic:pic>
-                          </wpg:wgp>
-                        </a:graphicData>
-                      </a:graphic>
-                    </wp:anchor>
-                  </w:drawing>
-                </mc:Choice>
-                <mc:Fallback>
-                  <w:pict>
-                    <v:group w14:anchorId="7D119CDC" id="Group 1" o:spid="_x0000_s1026" style="position:absolute;margin-left:119.5pt;margin-top:-4.35pt;width:9.2pt;height:9.2pt;z-index:-251657216;mso-wrap-distance-left:0;mso-wrap-distance-right:0" coordsize="116839,116839" o:gfxdata="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">
-                      <v:shapetype id="_x0000_t75" coordsize="21600,21600" o:spt="75" o:preferrelative="t" path="m@4@5l@4@11@9@11@9@5xe" filled="f" stroked="f">
-                        <v:stroke joinstyle="miter"/>
-                        <v:formulas>
-                          <v:f eqn="if lineDrawn pixelLineWidth 0"/>
-                          <v:f eqn="sum @0 1 0"/>
-                          <v:f eqn="sum 0 0 @1"/>
-                          <v:f eqn="prod @2 1 2"/>
-                          <v:f eqn="prod @3 21600 pixelWidth"/>
-                          <v:f eqn="prod @3 21600 pixelHeight"/>
-                          <v:f eqn="sum @0 0 1"/>
-                          <v:f eqn="prod @6 1 2"/>
-                          <v:f eqn="prod @7 21600 pixelWidth"/>
-                          <v:f eqn="sum @8 21600 0"/>
-                          <v:f eqn="prod @7 21600 pixelHeight"/>
-                          <v:f eqn="sum @10 21600 0"/>
-                        </v:formulas>
-                        <v:path o:extrusionok="f" gradientshapeok="t" o:connecttype="rect"/>
-                        <o:lock v:ext="edit" aspectratio="t"/>
-                      </v:shapetype>
-                      <v:shape id="Image 2" o:spid="_x0000_s1027" type="#_x0000_t75" style="position:absolute;width:116586;height:116585;visibility:visible;mso-wrap-style:square" o:gfxdata="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">
-                        <v:imagedata r:id="rId6" o:title=""/>
-                      </v:shape>
-                    </v:group>
-                  </w:pict>
-                </mc:Fallback>
-              </mc:AlternateContent>
-            </w:r>
-            <w:r>
-              <w:rPr>
-                <w:noProof/>
-                <w:sz w:val="15"/>
-              </w:rPr>
-              <mc:AlternateContent>
-                <mc:Choice Requires="wpg">
-                  <w:drawing>
-                    <wp:anchor distT="0" distB="0" distL="0" distR="0" simplePos="0" relativeHeight="251661312" behindDoc="1" locked="0" layoutInCell="1" allowOverlap="1" wp14:anchorId="450215F1" wp14:editId="7C108D86">
-                      <wp:simplePos x="0" y="0"/>
-                      <wp:positionH relativeFrom="column">
-                        <wp:posOffset>1517445</wp:posOffset>
-                      </wp:positionH>
-                      <wp:positionV relativeFrom="paragraph">
-                        <wp:posOffset>187328</wp:posOffset>
-                      </wp:positionV>
-                      <wp:extent cx="116839" cy="116839"/>
-                      <wp:effectExtent l="0" t="0" r="0" b="0"/>
-                      <wp:wrapNone/>
-                      <wp:docPr id="3" name="Group 3"/>
-                      <wp:cNvGraphicFramePr>
-                        <a:graphicFrameLocks xmlns:a="http://schemas.openxmlformats.org/drawingml/2006/main"/>
-                      </wp:cNvGraphicFramePr>
-                      <a:graphic xmlns:a="http://schemas.openxmlformats.org/drawingml/2006/main">
-                        <a:graphicData uri="http://schemas.microsoft.com/office/word/2010/wordprocessingGroup">
-                          <wpg:wgp>
-                            <wpg:cNvGrpSpPr>
-                              <a:grpSpLocks/>
-                            </wpg:cNvGrpSpPr>
-                            <wpg:grpSpPr>
-                              <a:xfrm>
-                                <a:off x="0" y="0"/>
-                                <a:ext cx="116839" cy="116839"/>
-                                <a:chOff x="0" y="0"/>
-                                <a:chExt cx="116839" cy="116839"/>
-                              </a:xfrm>
-                            </wpg:grpSpPr>
-                            <pic:pic xmlns:pic="http://schemas.openxmlformats.org/drawingml/2006/picture">
-                              <pic:nvPicPr>
-                                <pic:cNvPr id="4" name="Image 4"/>
-                                <pic:cNvPicPr/>
-                              </pic:nvPicPr>
-                              <pic:blipFill>
-                                <a:blip r:embed="rId7" cstate="print"/>
-                                <a:stretch>
-                                  <a:fillRect/>
-                                </a:stretch>
-                              </pic:blipFill>
-                              <pic:spPr>
-                                <a:xfrm>
-                                  <a:off x="0" y="0"/>
-                                  <a:ext cx="116586" cy="116585"/>
-                                </a:xfrm>
-                                <a:prstGeom prst="rect">
-                                  <a:avLst/>
-                                </a:prstGeom>
-                              </pic:spPr>
-                            </pic:pic>
-                          </wpg:wgp>
-                        </a:graphicData>
-                      </a:graphic>
-                    </wp:anchor>
-                  </w:drawing>
-                </mc:Choice>
-                <mc:Fallback>
-                  <w:pict>
-                    <v:group w14:anchorId="42FF7AD0" id="Group 3" o:spid="_x0000_s1026" style="position:absolute;margin-left:119.5pt;margin-top:14.75pt;width:9.2pt;height:9.2pt;z-index:-251655168;mso-wrap-distance-left:0;mso-wrap-distance-right:0" coordsize="116839,116839" o:gfxdata="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">
-                      <v:shape id="Image 4" o:spid="_x0000_s1027" type="#_x0000_t75" style="position:absolute;width:116586;height:116585;visibility:visible;mso-wrap-style:square" o:gfxdata="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">
-                        <v:imagedata r:id="rId8" o:title=""/>
-                      </v:shape>
-                    </v:group>
-                  </w:pict>
-                </mc:Fallback>
-              </mc:AlternateContent>
-            </w:r>
-            <w:r>
-              <w:rPr>
-                <w:noProof/>
-                <w:sz w:val="15"/>
-              </w:rPr>
-              <mc:AlternateContent>
-                <mc:Choice Requires="wpg">
-                  <w:drawing>
-                    <wp:anchor distT="0" distB="0" distL="0" distR="0" simplePos="0" relativeHeight="251663360" behindDoc="1" locked="0" layoutInCell="1" allowOverlap="1" wp14:anchorId="221238C1" wp14:editId="30180D52">
-                      <wp:simplePos x="0" y="0"/>
-                      <wp:positionH relativeFrom="column">
-                        <wp:posOffset>1517445</wp:posOffset>
-                      </wp:positionH>
-                      <wp:positionV relativeFrom="paragraph">
-                        <wp:posOffset>430119</wp:posOffset>
-                      </wp:positionV>
-                      <wp:extent cx="116839" cy="116839"/>
-                      <wp:effectExtent l="0" t="0" r="0" b="0"/>
-                      <wp:wrapNone/>
-                      <wp:docPr id="5" name="Group 5"/>
-                      <wp:cNvGraphicFramePr>
-                        <a:graphicFrameLocks xmlns:a="http://schemas.openxmlformats.org/drawingml/2006/main"/>
-                      </wp:cNvGraphicFramePr>
-                      <a:graphic xmlns:a="http://schemas.openxmlformats.org/drawingml/2006/main">
-                        <a:graphicData uri="http://schemas.microsoft.com/office/word/2010/wordprocessingGroup">
-                          <wpg:wgp>
-                            <wpg:cNvGrpSpPr>
-                              <a:grpSpLocks/>
-                            </wpg:cNvGrpSpPr>
-                            <wpg:grpSpPr>
-                              <a:xfrm>
-                                <a:off x="0" y="0"/>
-                                <a:ext cx="116839" cy="116839"/>
-                                <a:chOff x="0" y="0"/>
-                                <a:chExt cx="116839" cy="116839"/>
-                              </a:xfrm>
-                            </wpg:grpSpPr>
-                            <pic:pic xmlns:pic="http://schemas.openxmlformats.org/drawingml/2006/picture">
-                              <pic:nvPicPr>
-                                <pic:cNvPr id="6" name="Image 6"/>
-                                <pic:cNvPicPr/>
-                              </pic:nvPicPr>
-                              <pic:blipFill>
-                                <a:blip r:embed="rId7" cstate="print"/>
-                                <a:stretch>
-                                  <a:fillRect/>
-                                </a:stretch>
-                              </pic:blipFill>
-                              <pic:spPr>
-                                <a:xfrm>
-                                  <a:off x="0" y="0"/>
-                                  <a:ext cx="116586" cy="116585"/>
-                                </a:xfrm>
-                                <a:prstGeom prst="rect">
-                                  <a:avLst/>
-                                </a:prstGeom>
-                              </pic:spPr>
-                            </pic:pic>
-                          </wpg:wgp>
-                        </a:graphicData>
-                      </a:graphic>
-                    </wp:anchor>
-                  </w:drawing>
-                </mc:Choice>
-                <mc:Fallback>
-                  <w:pict>
-                    <v:group w14:anchorId="369BDC86" id="Group 5" o:spid="_x0000_s1026" style="position:absolute;margin-left:119.5pt;margin-top:33.85pt;width:9.2pt;height:9.2pt;z-index:-251653120;mso-wrap-distance-left:0;mso-wrap-distance-right:0" coordsize="116839,116839" o:gfxdata="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">
-                      <v:shape id="Image 6" o:spid="_x0000_s1027" type="#_x0000_t75" style="position:absolute;width:116586;height:116585;visibility:visible;mso-wrap-style:square" o:gfxdata="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">
-                        <v:imagedata r:id="rId8" o:title=""/>
-                      </v:shape>
-                    </v:group>
-                  </w:pict>
-                </mc:Fallback>
-              </mc:AlternateContent>
-            </w:r>
-            <w:r>
-              <w:rPr>
-                <w:spacing w:val="-10"/>
-                <w:sz w:val="15"/>
-              </w:rPr>
-              <w:t>:</w:t>
-            </w:r>
-          </w:p>
-        </w:tc>
-        <w:tc>
-          <w:tcPr>
-            <w:tcW w:w="1502" w:type="dxa"/>
-          </w:tcPr>
-          <w:p>
-            <w:pPr>
-              <w:pStyle w:val="TableParagraph"/>
-              <w:spacing w:before="72" w:line="532" w:lineRule="auto"/>
-              <w:ind w:left="131" w:right="792"/>
-              <w:rPr>
-                <w:sz w:val="15"/>
-              </w:rPr>
-            </w:pPr>
-            <w:r>
-              <w:rPr>
-                <w:noProof/>
-                <w:sz w:val="15"/>
-              </w:rPr>
-              <mc:AlternateContent>
-                <mc:Choice Requires="wpg">
-                  <w:drawing>
-                    <wp:anchor distT="0" distB="0" distL="0" distR="0" simplePos="0" relativeHeight="251660288" behindDoc="1" locked="0" layoutInCell="1" allowOverlap="1" wp14:anchorId="25C3C806" wp14:editId="62DD61B9">
-                      <wp:simplePos x="0" y="0"/>
-                      <wp:positionH relativeFrom="column">
-                        <wp:posOffset>916399</wp:posOffset>
-                      </wp:positionH>
-                      <wp:positionV relativeFrom="paragraph">
-                        <wp:posOffset>47658</wp:posOffset>
-                      </wp:positionV>
-                      <wp:extent cx="116839" cy="116839"/>
-                      <wp:effectExtent l="0" t="0" r="0" b="0"/>
-                      <wp:wrapNone/>
-                      <wp:docPr id="7" name="Group 7"/>
-                      <wp:cNvGraphicFramePr>
-                        <a:graphicFrameLocks xmlns:a="http://schemas.openxmlformats.org/drawingml/2006/main"/>
-                      </wp:cNvGraphicFramePr>
-                      <a:graphic xmlns:a="http://schemas.openxmlformats.org/drawingml/2006/main">
-                        <a:graphicData uri="http://schemas.microsoft.com/office/word/2010/wordprocessingGroup">
-                          <wpg:wgp>
-                            <wpg:cNvGrpSpPr>
-                              <a:grpSpLocks/>
-                            </wpg:cNvGrpSpPr>
-                            <wpg:grpSpPr>
-                              <a:xfrm>
-                                <a:off x="0" y="0"/>
-                                <a:ext cx="116839" cy="116839"/>
-                                <a:chOff x="0" y="0"/>
-                                <a:chExt cx="116839" cy="116839"/>
-                              </a:xfrm>
-                            </wpg:grpSpPr>
-                            <pic:pic xmlns:pic="http://schemas.openxmlformats.org/drawingml/2006/picture">
-                              <pic:nvPicPr>
-                                <pic:cNvPr id="8" name="Image 8"/>
-                                <pic:cNvPicPr/>
-                              </pic:nvPicPr>
-                              <pic:blipFill>
-                                <a:blip r:embed="rId7" cstate="print"/>
-                                <a:stretch>
-                                  <a:fillRect/>
-                                </a:stretch>
-                              </pic:blipFill>
-                              <pic:spPr>
-                                <a:xfrm>
-                                  <a:off x="0" y="0"/>
-                                  <a:ext cx="116586" cy="116585"/>
-                                </a:xfrm>
-                                <a:prstGeom prst="rect">
-                                  <a:avLst/>
-                                </a:prstGeom>
-                              </pic:spPr>
-                            </pic:pic>
-                          </wpg:wgp>
-                        </a:graphicData>
-                      </a:graphic>
-                    </wp:anchor>
-                  </w:drawing>
-                </mc:Choice>
-                <mc:Fallback>
-                  <w:pict>
-                    <v:group w14:anchorId="47347AC5" id="Group 7" o:spid="_x0000_s1026" style="position:absolute;margin-left:72.15pt;margin-top:3.75pt;width:9.2pt;height:9.2pt;z-index:-251656192;mso-wrap-distance-left:0;mso-wrap-distance-right:0" coordsize="116839,116839" o:gfxdata="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">
-                      <v:shape id="Image 8" o:spid="_x0000_s1027" type="#_x0000_t75" style="position:absolute;width:116586;height:116585;visibility:visible;mso-wrap-style:square" o:gfxdata="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">
-                        <v:imagedata r:id="rId8" o:title=""/>
-                      </v:shape>
-                    </v:group>
-                  </w:pict>
-                </mc:Fallback>
-              </mc:AlternateContent>
-            </w:r>
-            <w:r>
-              <w:rPr>
-                <w:spacing w:val="-4"/>
-                <w:sz w:val="15"/>
-              </w:rPr>
-              <w:t>DAU</w:t>
-            </w:r>
-            <w:r>
-              <w:rPr>
-                <w:sz w:val="15"/>
-              </w:rPr>
-              <w:t xml:space="preserve"> </w:t>
-            </w:r>
-            <w:r>
-              <w:rPr>
-                <w:spacing w:val="-5"/>
-                <w:sz w:val="15"/>
-              </w:rPr>
-              <w:t>DAK</w:t>
-            </w:r>
-          </w:p>
-          <w:p>
-            <w:pPr>
-              <w:pStyle w:val="TableParagraph"/>
-              <w:spacing w:line="171" w:lineRule="exact"/>
-              <w:ind w:left="131"/>
-              <w:rPr>
-                <w:sz w:val="15"/>
-              </w:rPr>
-            </w:pPr>
-            <w:r>
-              <w:rPr>
-                <w:noProof/>
-                <w:sz w:val="15"/>
-              </w:rPr>
-              <mc:AlternateContent>
-                <mc:Choice Requires="wpg">
-                  <w:drawing>
-                    <wp:anchor distT="0" distB="0" distL="0" distR="0" simplePos="0" relativeHeight="251662336" behindDoc="1" locked="0" layoutInCell="1" allowOverlap="1" wp14:anchorId="61FAE45A" wp14:editId="71172AFB">
-                      <wp:simplePos x="0" y="0"/>
-                      <wp:positionH relativeFrom="column">
-                        <wp:posOffset>916399</wp:posOffset>
-                      </wp:positionH>
-                      <wp:positionV relativeFrom="paragraph">
-                        <wp:posOffset>-241575</wp:posOffset>
-                      </wp:positionV>
-                      <wp:extent cx="116839" cy="116839"/>
-                      <wp:effectExtent l="0" t="0" r="0" b="0"/>
-                      <wp:wrapNone/>
-                      <wp:docPr id="9" name="Group 9"/>
-                      <wp:cNvGraphicFramePr>
-                        <a:graphicFrameLocks xmlns:a="http://schemas.openxmlformats.org/drawingml/2006/main"/>
-                      </wp:cNvGraphicFramePr>
-                      <a:graphic xmlns:a="http://schemas.openxmlformats.org/drawingml/2006/main">
-                        <a:graphicData uri="http://schemas.microsoft.com/office/word/2010/wordprocessingGroup">
-                          <wpg:wgp>
-                            <wpg:cNvGrpSpPr>
-                              <a:grpSpLocks/>
-                            </wpg:cNvGrpSpPr>
-                            <wpg:grpSpPr>
-                              <a:xfrm>
-                                <a:off x="0" y="0"/>
-                                <a:ext cx="116839" cy="116839"/>
-                                <a:chOff x="0" y="0"/>
-                                <a:chExt cx="116839" cy="116839"/>
-                              </a:xfrm>
-                            </wpg:grpSpPr>
-                            <pic:pic xmlns:pic="http://schemas.openxmlformats.org/drawingml/2006/picture">
-                              <pic:nvPicPr>
-                                <pic:cNvPr id="10" name="Image 10"/>
-                                <pic:cNvPicPr/>
-                              </pic:nvPicPr>
-                              <pic:blipFill>
-                                <a:blip r:embed="rId7" cstate="print"/>
-                                <a:stretch>
-                                  <a:fillRect/>
-                                </a:stretch>
-                              </pic:blipFill>
-                              <pic:spPr>
-                                <a:xfrm>
-                                  <a:off x="0" y="0"/>
-                                  <a:ext cx="116586" cy="116585"/>
-                                </a:xfrm>
-                                <a:prstGeom prst="rect">
-                                  <a:avLst/>
-                                </a:prstGeom>
-                              </pic:spPr>
-                            </pic:pic>
-                          </wpg:wgp>
-                        </a:graphicData>
-                      </a:graphic>
-                    </wp:anchor>
-                  </w:drawing>
-                </mc:Choice>
-                <mc:Fallback>
-                  <w:pict>
-                    <v:group w14:anchorId="49A214AC" id="Group 9" o:spid="_x0000_s1026" style="position:absolute;margin-left:72.15pt;margin-top:-19pt;width:9.2pt;height:9.2pt;z-index:-251654144;mso-wrap-distance-left:0;mso-wrap-distance-right:0" coordsize="116839,116839" o:gfxdata="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">
-                      <v:shape id="Image 10" o:spid="_x0000_s1027" type="#_x0000_t75" style="position:absolute;width:116586;height:116585;visibility:visible;mso-wrap-style:square" o:gfxdata="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">
-                        <v:imagedata r:id="rId8" o:title=""/>
-                      </v:shape>
-                    </v:group>
-                  </w:pict>
-                </mc:Fallback>
-              </mc:AlternateContent>
-            </w:r>
-            <w:r>
-              <w:rPr>
-                <w:noProof/>
-                <w:sz w:val="15"/>
-              </w:rPr>
-              <mc:AlternateContent>
-                <mc:Choice Requires="wpg">
-                  <w:drawing>
-                    <wp:anchor distT="0" distB="0" distL="0" distR="0" simplePos="0" relativeHeight="251664384" behindDoc="1" locked="0" layoutInCell="1" allowOverlap="1" wp14:anchorId="20D8DAAB" wp14:editId="3A4992C9">
-                      <wp:simplePos x="0" y="0"/>
-                      <wp:positionH relativeFrom="column">
-                        <wp:posOffset>916399</wp:posOffset>
-                      </wp:positionH>
-                      <wp:positionV relativeFrom="paragraph">
-                        <wp:posOffset>1216</wp:posOffset>
-                      </wp:positionV>
-                      <wp:extent cx="116839" cy="116839"/>
-                      <wp:effectExtent l="0" t="0" r="0" b="0"/>
-                      <wp:wrapNone/>
-                      <wp:docPr id="11" name="Group 11"/>
-                      <wp:cNvGraphicFramePr>
-                        <a:graphicFrameLocks xmlns:a="http://schemas.openxmlformats.org/drawingml/2006/main"/>
-                      </wp:cNvGraphicFramePr>
-                      <a:graphic xmlns:a="http://schemas.openxmlformats.org/drawingml/2006/main">
-                        <a:graphicData uri="http://schemas.microsoft.com/office/word/2010/wordprocessingGroup">
-                          <wpg:wgp>
-                            <wpg:cNvGrpSpPr>
-                              <a:grpSpLocks/>
-                            </wpg:cNvGrpSpPr>
-                            <wpg:grpSpPr>
-                              <a:xfrm>
-                                <a:off x="0" y="0"/>
-                                <a:ext cx="116839" cy="116839"/>
-                                <a:chOff x="0" y="0"/>
-                                <a:chExt cx="116839" cy="116839"/>
-                              </a:xfrm>
-                            </wpg:grpSpPr>
-                            <pic:pic xmlns:pic="http://schemas.openxmlformats.org/drawingml/2006/picture">
-                              <pic:nvPicPr>
-                                <pic:cNvPr id="12" name="Image 12"/>
-                                <pic:cNvPicPr/>
-                              </pic:nvPicPr>
-                              <pic:blipFill>
-                                <a:blip r:embed="rId7" cstate="print"/>
-                                <a:stretch>
-                                  <a:fillRect/>
-                                </a:stretch>
-                              </pic:blipFill>
-                              <pic:spPr>
-                                <a:xfrm>
-                                  <a:off x="0" y="0"/>
-                                  <a:ext cx="116586" cy="116585"/>
-                                </a:xfrm>
-                                <a:prstGeom prst="rect">
-                                  <a:avLst/>
-                                </a:prstGeom>
-                              </pic:spPr>
-                            </pic:pic>
-                          </wpg:wgp>
-                        </a:graphicData>
-                      </a:graphic>
-                    </wp:anchor>
-                  </w:drawing>
-                </mc:Choice>
-                <mc:Fallback>
-                  <w:pict>
-                    <v:group w14:anchorId="775B0352" id="Group 11" o:spid="_x0000_s1026" style="position:absolute;margin-left:72.15pt;margin-top:.1pt;width:9.2pt;height:9.2pt;z-index:-251652096;mso-wrap-distance-left:0;mso-wrap-distance-right:0" coordsize="116839,116839" o:gfxdata="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">
-                      <v:shape id="Image 12" o:spid="_x0000_s1027" type="#_x0000_t75" style="position:absolute;width:116586;height:116585;visibility:visible;mso-wrap-style:square" o:gfxdata="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">
-                        <v:imagedata r:id="rId8" o:title=""/>
-                      </v:shape>
-                    </v:group>
-                  </w:pict>
-                </mc:Fallback>
-              </mc:AlternateContent>
-            </w:r>
-            <w:r>
-              <w:rPr>
-                <w:spacing w:val="-5"/>
-                <w:sz w:val="15"/>
-              </w:rPr>
-              <w:t>DID</w:t>
-            </w:r>
-          </w:p>
-        </w:tc>
-        <w:tc>
-          <w:tcPr>
-            <w:tcW w:w="1488" w:type="dxa"/>
-          </w:tcPr>
-          <w:p>
-            <w:pPr>
-              <w:pStyle w:val="TableParagraph"/>
-              <w:spacing w:before="72"/>
-              <w:ind w:left="212"/>
-              <w:rPr>
-                <w:sz w:val="15"/>
-              </w:rPr>
-            </w:pPr>
-            <w:r>
-              <w:rPr>
-                <w:spacing w:val="-2"/>
-                <w:sz w:val="15"/>
-              </w:rPr>
-              <w:t>SILPA</w:t>
-            </w:r>
-          </w:p>
-          <w:p>
-            <w:pPr>
-              <w:pStyle w:val="TableParagraph"/>
-              <w:spacing w:before="2" w:line="380" w:lineRule="atLeast"/>
-              <w:ind w:left="212"/>
-              <w:rPr>
-                <w:sz w:val="15"/>
-              </w:rPr>
-            </w:pPr>
-            <w:r>
-              <w:rPr>
-                <w:sz w:val="15"/>
-              </w:rPr>
-              <w:t>DBH</w:t>
-            </w:r>
-            <w:r>
-              <w:rPr>
-                <w:spacing w:val="-7"/>
-                <w:sz w:val="15"/>
-              </w:rPr>
-              <w:t xml:space="preserve"> </w:t>
-            </w:r>
-            <w:r>
-              <w:rPr>
-                <w:sz w:val="15"/>
-              </w:rPr>
-              <w:t>Pajak</w:t>
-            </w:r>
-            <w:r>
-              <w:rPr>
-                <w:spacing w:val="-7"/>
-                <w:sz w:val="15"/>
-              </w:rPr>
-              <w:t xml:space="preserve"> </w:t>
-            </w:r>
-            <w:r>
-              <w:rPr>
-                <w:sz w:val="15"/>
-              </w:rPr>
-              <w:t xml:space="preserve">Rokok </w:t>
-            </w:r>
-            <w:r>
-              <w:rPr>
-                <w:spacing w:val="-4"/>
-                <w:sz w:val="15"/>
-              </w:rPr>
-              <w:t>PAD</w:t>
-            </w:r>
-          </w:p>
-        </w:tc>
-      </w:tr>
-      <w:tr>
-        <w:trPr>
-          <w:trHeight w:val="382"/>
-        </w:trPr>
-        <w:tc>
-          <w:tcPr>
-            <w:tcW w:w="2484" w:type="dxa"/>
-          </w:tcPr>
-          <w:p>
-            <w:pPr>
-              <w:pStyle w:val="TableParagraph"/>
-              <w:rPr>
-                <w:rFonts w:ascii="Times New Roman"/>
-                <w:sz w:val="14"/>
-              </w:rPr>
-            </w:pPr>
-          </w:p>
-        </w:tc>
-        <w:tc>
-          <w:tcPr>
-            <w:tcW w:w="1502" w:type="dxa"/>
-          </w:tcPr>
-          <w:p>
-            <w:pPr>
-              <w:pStyle w:val="TableParagraph"/>
-              <w:spacing w:before="103"/>
-              <w:ind w:left="131"/>
-              <w:rPr>
-                <w:sz w:val="15"/>
-              </w:rPr>
-            </w:pPr>
-            <w:r>
-              <w:rPr>
-                <w:noProof/>
-                <w:sz w:val="15"/>
-              </w:rPr>
-              <mc:AlternateContent>
-                <mc:Choice Requires="wpg">
-                  <w:drawing>
-                    <wp:anchor distT="0" distB="0" distL="0" distR="0" simplePos="0" relativeHeight="251665408" behindDoc="1" locked="0" layoutInCell="1" allowOverlap="1" wp14:anchorId="3390F97E" wp14:editId="5BC033C2">
-                      <wp:simplePos x="0" y="0"/>
-                      <wp:positionH relativeFrom="column">
-                        <wp:posOffset>-59621</wp:posOffset>
-                      </wp:positionH>
-                      <wp:positionV relativeFrom="paragraph">
-                        <wp:posOffset>67343</wp:posOffset>
-                      </wp:positionV>
-                      <wp:extent cx="116839" cy="116839"/>
-                      <wp:effectExtent l="0" t="0" r="0" b="0"/>
-                      <wp:wrapNone/>
-                      <wp:docPr id="13" name="Group 13"/>
-                      <wp:cNvGraphicFramePr>
-                        <a:graphicFrameLocks xmlns:a="http://schemas.openxmlformats.org/drawingml/2006/main"/>
-                      </wp:cNvGraphicFramePr>
-                      <a:graphic xmlns:a="http://schemas.openxmlformats.org/drawingml/2006/main">
-                        <a:graphicData uri="http://schemas.microsoft.com/office/word/2010/wordprocessingGroup">
-                          <wpg:wgp>
-                            <wpg:cNvGrpSpPr>
-                              <a:grpSpLocks/>
-                            </wpg:cNvGrpSpPr>
-                            <wpg:grpSpPr>
-                              <a:xfrm>
-                                <a:off x="0" y="0"/>
-                                <a:ext cx="116839" cy="116839"/>
-                                <a:chOff x="0" y="0"/>
-                                <a:chExt cx="116839" cy="116839"/>
-                              </a:xfrm>
-                            </wpg:grpSpPr>
-                            <pic:pic xmlns:pic="http://schemas.openxmlformats.org/drawingml/2006/picture">
-                              <pic:nvPicPr>
-                                <pic:cNvPr id="14" name="Image 14"/>
-                                <pic:cNvPicPr/>
-                              </pic:nvPicPr>
-                              <pic:blipFill>
-                                <a:blip r:embed="rId7" cstate="print"/>
-                                <a:stretch>
-                                  <a:fillRect/>
-                                </a:stretch>
-                              </pic:blipFill>
-                              <pic:spPr>
-                                <a:xfrm>
-                                  <a:off x="0" y="0"/>
-                                  <a:ext cx="116586" cy="116585"/>
-                                </a:xfrm>
-                                <a:prstGeom prst="rect">
-                                  <a:avLst/>
-                                </a:prstGeom>
-                              </pic:spPr>
-                            </pic:pic>
-                          </wpg:wgp>
-                        </a:graphicData>
-                      </a:graphic>
-                    </wp:anchor>
-                  </w:drawing>
-                </mc:Choice>
-                <mc:Fallback>
-                  <w:pict>
-                    <v:group w14:anchorId="04178F4F" id="Group 13" o:spid="_x0000_s1026" style="position:absolute;margin-left:-4.7pt;margin-top:5.3pt;width:9.2pt;height:9.2pt;z-index:-251651072;mso-wrap-distance-left:0;mso-wrap-distance-right:0" coordsize="116839,116839" o:gfxdata="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">
-                      <v:shape id="Image 14" o:spid="_x0000_s1027" type="#_x0000_t75" style="position:absolute;width:116586;height:116585;visibility:visible;mso-wrap-style:square" o:gfxdata="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">
-                        <v:imagedata r:id="rId8" o:title=""/>
-                      </v:shape>
-                    </v:group>
-                  </w:pict>
-                </mc:Fallback>
-              </mc:AlternateContent>
-            </w:r>
-            <w:r>
-              <w:rPr>
-                <w:noProof/>
-                <w:sz w:val="15"/>
-              </w:rPr>
-              <mc:AlternateContent>
-                <mc:Choice Requires="wpg">
-                  <w:drawing>
-                    <wp:anchor distT="0" distB="0" distL="0" distR="0" simplePos="0" relativeHeight="251666432" behindDoc="1" locked="0" layoutInCell="1" allowOverlap="1" wp14:anchorId="778E8346" wp14:editId="314F008D">
-                      <wp:simplePos x="0" y="0"/>
-                      <wp:positionH relativeFrom="column">
-                        <wp:posOffset>916399</wp:posOffset>
-                      </wp:positionH>
-                      <wp:positionV relativeFrom="paragraph">
-                        <wp:posOffset>67343</wp:posOffset>
-                      </wp:positionV>
-                      <wp:extent cx="116839" cy="116839"/>
-                      <wp:effectExtent l="0" t="0" r="0" b="0"/>
-                      <wp:wrapNone/>
-                      <wp:docPr id="15" name="Group 15"/>
-                      <wp:cNvGraphicFramePr>
-                        <a:graphicFrameLocks xmlns:a="http://schemas.openxmlformats.org/drawingml/2006/main"/>
-                      </wp:cNvGraphicFramePr>
-                      <a:graphic xmlns:a="http://schemas.openxmlformats.org/drawingml/2006/main">
-                        <a:graphicData uri="http://schemas.microsoft.com/office/word/2010/wordprocessingGroup">
-                          <wpg:wgp>
-                            <wpg:cNvGrpSpPr>
-                              <a:grpSpLocks/>
-                            </wpg:cNvGrpSpPr>
-                            <wpg:grpSpPr>
-                              <a:xfrm>
-                                <a:off x="0" y="0"/>
-                                <a:ext cx="116839" cy="116839"/>
-                                <a:chOff x="0" y="0"/>
-                                <a:chExt cx="116839" cy="116839"/>
-                              </a:xfrm>
-                            </wpg:grpSpPr>
-                            <pic:pic xmlns:pic="http://schemas.openxmlformats.org/drawingml/2006/picture">
-                              <pic:nvPicPr>
-                                <pic:cNvPr id="16" name="Image 16"/>
-                                <pic:cNvPicPr/>
-                              </pic:nvPicPr>
-                              <pic:blipFill>
-                                <a:blip r:embed="rId7" cstate="print"/>
-                                <a:stretch>
-                                  <a:fillRect/>
-                                </a:stretch>
-                              </pic:blipFill>
-                              <pic:spPr>
-                                <a:xfrm>
-                                  <a:off x="0" y="0"/>
-                                  <a:ext cx="116586" cy="116585"/>
-                                </a:xfrm>
-                                <a:prstGeom prst="rect">
-                                  <a:avLst/>
-                                </a:prstGeom>
-                              </pic:spPr>
-                            </pic:pic>
-                          </wpg:wgp>
-                        </a:graphicData>
-                      </a:graphic>
-                    </wp:anchor>
-                  </w:drawing>
-                </mc:Choice>
-                <mc:Fallback>
-                  <w:pict>
-                    <v:group w14:anchorId="13A02854" id="Group 15" o:spid="_x0000_s1026" style="position:absolute;margin-left:72.15pt;margin-top:5.3pt;width:9.2pt;height:9.2pt;z-index:-251650048;mso-wrap-distance-left:0;mso-wrap-distance-right:0" coordsize="116839,116839" o:gfxdata="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">
-                      <v:shape id="Image 16" o:spid="_x0000_s1027" type="#_x0000_t75" style="position:absolute;width:116586;height:116585;visibility:visible;mso-wrap-style:square" o:gfxdata="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">
-                        <v:imagedata r:id="rId8" o:title=""/>
-                      </v:shape>
-                    </v:group>
-                  </w:pict>
-                </mc:Fallback>
-              </mc:AlternateContent>
-            </w:r>
-            <w:r>
-              <w:rPr>
-                <w:sz w:val="15"/>
-              </w:rPr>
-              <w:t>Bantuan</w:t>
-            </w:r>
-            <w:r>
-              <w:rPr>
-                <w:spacing w:val="5"/>
-                <w:sz w:val="15"/>
-              </w:rPr>
-              <w:t xml:space="preserve"> </w:t>
-            </w:r>
-            <w:r>
-              <w:rPr>
-                <w:spacing w:val="-2"/>
-                <w:sz w:val="15"/>
-              </w:rPr>
-              <w:t>Provinsi</w:t>
-            </w:r>
-          </w:p>
-        </w:tc>
-        <w:tc>
-          <w:tcPr>
-            <w:tcW w:w="1488" w:type="dxa"/>
-          </w:tcPr>
-          <w:p>
-            <w:pPr>
-              <w:pStyle w:val="TableParagraph"/>
-              <w:spacing w:before="103"/>
-              <w:ind w:left="212"/>
-              <w:rPr>
-                <w:sz w:val="15"/>
-              </w:rPr>
-            </w:pPr>
-            <w:r>
-              <w:rPr>
-                <w:spacing w:val="-2"/>
-                <w:sz w:val="15"/>
-              </w:rPr>
-              <w:t>DBHCT</w:t>
-            </w:r>
-          </w:p>
-        </w:tc>
-      </w:tr>
-      <w:tr>
-        <w:trPr>
-          <w:trHeight w:val="276"/>
-        </w:trPr>
-        <w:tc>
-          <w:tcPr>
-            <w:tcW w:w="2484" w:type="dxa"/>
-          </w:tcPr>
-          <w:p>
-            <w:pPr>
-              <w:pStyle w:val="TableParagraph"/>
-              <w:rPr>
-                <w:rFonts w:ascii="Times New Roman"/>
-                <w:sz w:val="14"/>
-              </w:rPr>
-            </w:pPr>
-          </w:p>
-        </w:tc>
-        <w:tc>
-          <w:tcPr>
-            <w:tcW w:w="1502" w:type="dxa"/>
-          </w:tcPr>
-          <w:p>
-            <w:pPr>
-              <w:pStyle w:val="TableParagraph"/>
-              <w:spacing w:before="103" w:line="153" w:lineRule="exact"/>
-              <w:ind w:left="131"/>
-              <w:rPr>
-                <w:sz w:val="15"/>
-              </w:rPr>
-            </w:pPr>
-            <w:r>
-              <w:rPr>
-                <w:noProof/>
-                <w:sz w:val="15"/>
-              </w:rPr>
-              <mc:AlternateContent>
-                <mc:Choice Requires="wpg">
-                  <w:drawing>
-                    <wp:anchor distT="0" distB="0" distL="0" distR="0" simplePos="0" relativeHeight="251667456" behindDoc="1" locked="0" layoutInCell="1" allowOverlap="1" wp14:anchorId="3ED4FF42" wp14:editId="0C515F3F">
-                      <wp:simplePos x="0" y="0"/>
-                      <wp:positionH relativeFrom="column">
-                        <wp:posOffset>-59621</wp:posOffset>
-                      </wp:positionH>
-                      <wp:positionV relativeFrom="paragraph">
-                        <wp:posOffset>67343</wp:posOffset>
-                      </wp:positionV>
-                      <wp:extent cx="116839" cy="116839"/>
-                      <wp:effectExtent l="0" t="0" r="0" b="0"/>
-                      <wp:wrapNone/>
-                      <wp:docPr id="17" name="Group 17"/>
-                      <wp:cNvGraphicFramePr>
-                        <a:graphicFrameLocks xmlns:a="http://schemas.openxmlformats.org/drawingml/2006/main"/>
-                      </wp:cNvGraphicFramePr>
-                      <a:graphic xmlns:a="http://schemas.openxmlformats.org/drawingml/2006/main">
-                        <a:graphicData uri="http://schemas.microsoft.com/office/word/2010/wordprocessingGroup">
-                          <wpg:wgp>
-                            <wpg:cNvGrpSpPr>
-                              <a:grpSpLocks/>
-                            </wpg:cNvGrpSpPr>
-                            <wpg:grpSpPr>
-                              <a:xfrm>
-                                <a:off x="0" y="0"/>
-                                <a:ext cx="116839" cy="116839"/>
-                                <a:chOff x="0" y="0"/>
-                                <a:chExt cx="116839" cy="116839"/>
-                              </a:xfrm>
-                            </wpg:grpSpPr>
-                            <pic:pic xmlns:pic="http://schemas.openxmlformats.org/drawingml/2006/picture">
-                              <pic:nvPicPr>
-                                <pic:cNvPr id="18" name="Image 18"/>
-                                <pic:cNvPicPr/>
-                              </pic:nvPicPr>
-                              <pic:blipFill>
-                                <a:blip r:embed="rId7" cstate="print"/>
-                                <a:stretch>
-                                  <a:fillRect/>
-                                </a:stretch>
-                              </pic:blipFill>
-                              <pic:spPr>
-                                <a:xfrm>
-                                  <a:off x="0" y="0"/>
-                                  <a:ext cx="116586" cy="116585"/>
-                                </a:xfrm>
-                                <a:prstGeom prst="rect">
-                                  <a:avLst/>
-                                </a:prstGeom>
-                              </pic:spPr>
-                            </pic:pic>
-                          </wpg:wgp>
-                        </a:graphicData>
-                      </a:graphic>
-                    </wp:anchor>
-                  </w:drawing>
-                </mc:Choice>
-                <mc:Fallback>
-                  <w:pict>
-                    <v:group w14:anchorId="1C011E6A" id="Group 17" o:spid="_x0000_s1026" style="position:absolute;margin-left:-4.7pt;margin-top:5.3pt;width:9.2pt;height:9.2pt;z-index:-251649024;mso-wrap-distance-left:0;mso-wrap-distance-right:0" coordsize="116839,116839" o:gfxdata="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">
-                      <v:shape id="Image 18" o:spid="_x0000_s1027" type="#_x0000_t75" style="position:absolute;width:116586;height:116585;visibility:visible;mso-wrap-style:square" o:gfxdata="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">
-                        <v:imagedata r:id="rId8" o:title=""/>
-                      </v:shape>
-                    </v:group>
-                  </w:pict>
-                </mc:Fallback>
-              </mc:AlternateContent>
-            </w:r>
-            <w:r>
-              <w:rPr>
-                <w:noProof/>
-                <w:sz w:val="15"/>
-              </w:rPr>
-              <mc:AlternateContent>
-                <mc:Choice Requires="wpg">
-                  <w:drawing>
-                    <wp:anchor distT="0" distB="0" distL="0" distR="0" simplePos="0" relativeHeight="251668480" behindDoc="1" locked="0" layoutInCell="1" allowOverlap="1" wp14:anchorId="28BFA651" wp14:editId="5B5C2E44">
-                      <wp:simplePos x="0" y="0"/>
-                      <wp:positionH relativeFrom="column">
-                        <wp:posOffset>916399</wp:posOffset>
-                      </wp:positionH>
-                      <wp:positionV relativeFrom="paragraph">
-                        <wp:posOffset>67343</wp:posOffset>
-                      </wp:positionV>
-                      <wp:extent cx="116839" cy="116839"/>
-                      <wp:effectExtent l="0" t="0" r="0" b="0"/>
-                      <wp:wrapNone/>
-                      <wp:docPr id="19" name="Group 19"/>
-                      <wp:cNvGraphicFramePr>
-                        <a:graphicFrameLocks xmlns:a="http://schemas.openxmlformats.org/drawingml/2006/main"/>
-                      </wp:cNvGraphicFramePr>
-                      <a:graphic xmlns:a="http://schemas.openxmlformats.org/drawingml/2006/main">
-                        <a:graphicData uri="http://schemas.microsoft.com/office/word/2010/wordprocessingGroup">
-                          <wpg:wgp>
-                            <wpg:cNvGrpSpPr>
-                              <a:grpSpLocks/>
-                            </wpg:cNvGrpSpPr>
-                            <wpg:grpSpPr>
-                              <a:xfrm>
-                                <a:off x="0" y="0"/>
-                                <a:ext cx="116839" cy="116839"/>
-                                <a:chOff x="0" y="0"/>
-                                <a:chExt cx="116839" cy="116839"/>
-                              </a:xfrm>
-                            </wpg:grpSpPr>
-                            <pic:pic xmlns:pic="http://schemas.openxmlformats.org/drawingml/2006/picture">
-                              <pic:nvPicPr>
-                                <pic:cNvPr id="20" name="Image 20"/>
-                                <pic:cNvPicPr/>
-                              </pic:nvPicPr>
-                              <pic:blipFill>
-                                <a:blip r:embed="rId7" cstate="print"/>
-                                <a:stretch>
-                                  <a:fillRect/>
-                                </a:stretch>
-                              </pic:blipFill>
-                              <pic:spPr>
-                                <a:xfrm>
-                                  <a:off x="0" y="0"/>
-                                  <a:ext cx="116586" cy="116585"/>
-                                </a:xfrm>
-                                <a:prstGeom prst="rect">
-                                  <a:avLst/>
-                                </a:prstGeom>
-                              </pic:spPr>
-                            </pic:pic>
-                          </wpg:wgp>
-                        </a:graphicData>
-                      </a:graphic>
-                    </wp:anchor>
-                  </w:drawing>
-                </mc:Choice>
-                <mc:Fallback>
-                  <w:pict>
-                    <v:group w14:anchorId="00698F97" id="Group 19" o:spid="_x0000_s1026" style="position:absolute;margin-left:72.15pt;margin-top:5.3pt;width:9.2pt;height:9.2pt;z-index:-251648000;mso-wrap-distance-left:0;mso-wrap-distance-right:0" coordsize="116839,116839" o:gfxdata="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">
-                      <v:shape id="Image 20" o:spid="_x0000_s1027" type="#_x0000_t75" style="position:absolute;width:116586;height:116585;visibility:visible;mso-wrap-style:square" o:gfxdata="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">
-                        <v:imagedata r:id="rId8" o:title=""/>
-                      </v:shape>
-                    </v:group>
-                  </w:pict>
-                </mc:Fallback>
-              </mc:AlternateContent>
-            </w:r>
-            <w:r>
-              <w:rPr>
-                <w:spacing w:val="-5"/>
-                <w:sz w:val="15"/>
-              </w:rPr>
-              <w:t>DBH</w:t>
-            </w:r>
-          </w:p>
-        </w:tc>
-        <w:tc>
-          <w:tcPr>
-            <w:tcW w:w="1488" w:type="dxa"/>
-          </w:tcPr>
-          <w:p>
-            <w:pPr>
-              <w:pStyle w:val="TableParagraph"/>
-              <w:spacing w:before="103" w:line="153" w:lineRule="exact"/>
-              <w:ind w:left="212"/>
-              <w:rPr>
-                <w:sz w:val="15"/>
-              </w:rPr>
-            </w:pPr>
-            <w:r>
-              <w:rPr>
-                <w:sz w:val="15"/>
-              </w:rPr>
-              <w:t>DBH</w:t>
-            </w:r>
-            <w:r>
-              <w:rPr>
-                <w:spacing w:val="3"/>
-                <w:sz w:val="15"/>
-              </w:rPr>
-              <w:t xml:space="preserve"> </w:t>
-            </w:r>
-            <w:r>
-              <w:rPr>
-                <w:spacing w:val="-4"/>
-                <w:sz w:val="15"/>
-              </w:rPr>
-              <w:t>Prov</w:t>
-            </w:r>
-          </w:p>
-        </w:tc>
-      </w:tr>
-    </w:tbl>
     <w:p>
       <w:pPr>
-        <w:jc w:val="center"/>
         <w:rPr>
           <w:b/>
           <w:bCs/>
@@ -1217,37 +49,551 @@
     </w:p>
     <w:p>
       <w:pPr>
-        <w:jc w:val="center"/>
         <w:rPr>
-          <w:b/>
-          <w:bCs/>
           <w:sz w:val="20"/>
           <w:szCs w:val="20"/>
-          <w:u w:val="single"/>
+        </w:rPr>
+      </w:pPr>
+      <w:r>
+        <w:rPr>
+          <w:sz w:val="20"/>
+          <w:szCs w:val="20"/>
+        </w:rPr>
+        <w:t xml:space="preserve"> </w:t>
+      </w:r>
+    </w:p>
+    <w:tbl>
+      <w:tblPr>
+        <w:tblStyle w:val="TableGrid"/>
+        <w:tblW w:w="0" w:type="auto"/>
+        <w:tblBorders>
+          <w:top w:val="none" w:sz="0" w:space="0" w:color="auto"/>
+          <w:left w:val="none" w:sz="0" w:space="0" w:color="auto"/>
+          <w:bottom w:val="none" w:sz="0" w:space="0" w:color="auto"/>
+          <w:right w:val="none" w:sz="0" w:space="0" w:color="auto"/>
+          <w:insideH w:val="none" w:sz="0" w:space="0" w:color="auto"/>
+          <w:insideV w:val="none" w:sz="0" w:space="0" w:color="auto"/>
+        </w:tblBorders>
+        <w:tblLook w:val="04A0" w:firstRow="1" w:lastRow="0" w:firstColumn="1" w:lastColumn="0" w:noHBand="0" w:noVBand="1"/>
+      </w:tblPr>
+      <w:tblGrid>
+        <w:gridCol w:w="3539"/>
+        <w:gridCol w:w="2693"/>
+        <w:gridCol w:w="2980"/>
+      </w:tblGrid>
+      <w:tr>
+        <w:tc>
+          <w:tcPr>
+            <w:tcW w:w="3539" w:type="dxa"/>
+          </w:tcPr>
+          <w:p>
+            <w:pPr>
+              <w:rPr>
+                <w:sz w:val="20"/>
+                <w:szCs w:val="20"/>
+              </w:rPr>
+            </w:pPr>
+            <w:r>
+              <w:rPr>
+                <w:sz w:val="20"/>
+                <w:szCs w:val="20"/>
+              </w:rPr>
+              <w:t>Kegiatan yang dananya berasal dari:</w:t>
+            </w:r>
+          </w:p>
+        </w:tc>
+        <w:tc>
+          <w:tcPr>
+            <w:tcW w:w="2693" w:type="dxa"/>
+          </w:tcPr>
+          <w:p>
+            <w:pPr>
+              <w:rPr>
+                <w:sz w:val="20"/>
+                <w:szCs w:val="20"/>
+              </w:rPr>
+            </w:pPr>
+            <w:r>
+              <w:rPr>
+                <w:sz w:val="20"/>
+                <w:szCs w:val="20"/>
+              </w:rPr>
+              <w:t>{</w:t>
+            </w:r>
+            <w:r>
+              <w:rPr>
+                <w:sz w:val="20"/>
+                <w:szCs w:val="20"/>
+              </w:rPr>
+              <w:t>check</w:t>
+            </w:r>
+            <w:r>
+              <w:rPr>
+                <w:sz w:val="20"/>
+                <w:szCs w:val="20"/>
+              </w:rPr>
+              <w:t>_</w:t>
+            </w:r>
+            <w:r>
+              <w:rPr>
+                <w:sz w:val="20"/>
+                <w:szCs w:val="20"/>
+              </w:rPr>
+              <w:t>dau</w:t>
+            </w:r>
+            <w:r>
+              <w:rPr>
+                <w:sz w:val="20"/>
+                <w:szCs w:val="20"/>
+              </w:rPr>
+              <w:t xml:space="preserve">} </w:t>
+            </w:r>
+            <w:r>
+              <w:rPr>
+                <w:sz w:val="20"/>
+                <w:szCs w:val="20"/>
+              </w:rPr>
+              <w:t>DAU</w:t>
+            </w:r>
+          </w:p>
+        </w:tc>
+        <w:tc>
+          <w:tcPr>
+            <w:tcW w:w="2980" w:type="dxa"/>
+          </w:tcPr>
+          <w:p>
+            <w:pPr>
+              <w:rPr>
+                <w:sz w:val="20"/>
+                <w:szCs w:val="20"/>
+              </w:rPr>
+            </w:pPr>
+            <w:r>
+              <w:rPr>
+                <w:sz w:val="20"/>
+                <w:szCs w:val="20"/>
+              </w:rPr>
+              <w:t>{check_</w:t>
+            </w:r>
+            <w:r>
+              <w:rPr>
+                <w:sz w:val="20"/>
+                <w:szCs w:val="20"/>
+              </w:rPr>
+              <w:t>silpa</w:t>
+            </w:r>
+            <w:r>
+              <w:rPr>
+                <w:sz w:val="20"/>
+                <w:szCs w:val="20"/>
+              </w:rPr>
+              <w:t xml:space="preserve">} </w:t>
+            </w:r>
+            <w:r>
+              <w:rPr>
+                <w:sz w:val="20"/>
+                <w:szCs w:val="20"/>
+              </w:rPr>
+              <w:t>SILPA</w:t>
+            </w:r>
+          </w:p>
+        </w:tc>
+      </w:tr>
+      <w:tr>
+        <w:tc>
+          <w:tcPr>
+            <w:tcW w:w="3539" w:type="dxa"/>
+          </w:tcPr>
+          <w:p>
+            <w:pPr>
+              <w:rPr>
+                <w:sz w:val="20"/>
+                <w:szCs w:val="20"/>
+              </w:rPr>
+            </w:pPr>
+          </w:p>
+        </w:tc>
+        <w:tc>
+          <w:tcPr>
+            <w:tcW w:w="2693" w:type="dxa"/>
+          </w:tcPr>
+          <w:p>
+            <w:pPr>
+              <w:rPr>
+                <w:sz w:val="20"/>
+                <w:szCs w:val="20"/>
+              </w:rPr>
+            </w:pPr>
+            <w:r>
+              <w:rPr>
+                <w:sz w:val="20"/>
+                <w:szCs w:val="20"/>
+              </w:rPr>
+              <w:t>{check_</w:t>
+            </w:r>
+            <w:r>
+              <w:rPr>
+                <w:sz w:val="20"/>
+                <w:szCs w:val="20"/>
+              </w:rPr>
+              <w:t>dak</w:t>
+            </w:r>
+            <w:r>
+              <w:rPr>
+                <w:sz w:val="20"/>
+                <w:szCs w:val="20"/>
+              </w:rPr>
+              <w:t xml:space="preserve">} </w:t>
+            </w:r>
+            <w:r>
+              <w:rPr>
+                <w:sz w:val="20"/>
+                <w:szCs w:val="20"/>
+              </w:rPr>
+              <w:t>DAK</w:t>
+            </w:r>
+          </w:p>
+        </w:tc>
+        <w:tc>
+          <w:tcPr>
+            <w:tcW w:w="2980" w:type="dxa"/>
+          </w:tcPr>
+          <w:p>
+            <w:pPr>
+              <w:rPr>
+                <w:sz w:val="20"/>
+                <w:szCs w:val="20"/>
+              </w:rPr>
+            </w:pPr>
+            <w:r>
+              <w:rPr>
+                <w:sz w:val="20"/>
+                <w:szCs w:val="20"/>
+              </w:rPr>
+              <w:t>{</w:t>
+            </w:r>
+            <w:r>
+              <w:rPr>
+                <w:sz w:val="20"/>
+                <w:szCs w:val="20"/>
+              </w:rPr>
+              <w:t>check_dbh_pajak_rokok</w:t>
+            </w:r>
+            <w:r>
+              <w:rPr>
+                <w:sz w:val="20"/>
+                <w:szCs w:val="20"/>
+              </w:rPr>
+              <w:t xml:space="preserve">} </w:t>
+            </w:r>
+            <w:r>
+              <w:rPr>
+                <w:sz w:val="20"/>
+                <w:szCs w:val="20"/>
+              </w:rPr>
+              <w:t>DBH Pajak Rokok</w:t>
+            </w:r>
+          </w:p>
+        </w:tc>
+      </w:tr>
+      <w:tr>
+        <w:tc>
+          <w:tcPr>
+            <w:tcW w:w="3539" w:type="dxa"/>
+          </w:tcPr>
+          <w:p>
+            <w:pPr>
+              <w:rPr>
+                <w:sz w:val="20"/>
+                <w:szCs w:val="20"/>
+              </w:rPr>
+            </w:pPr>
+          </w:p>
+        </w:tc>
+        <w:tc>
+          <w:tcPr>
+            <w:tcW w:w="2693" w:type="dxa"/>
+          </w:tcPr>
+          <w:p>
+            <w:pPr>
+              <w:rPr>
+                <w:sz w:val="20"/>
+                <w:szCs w:val="20"/>
+              </w:rPr>
+            </w:pPr>
+            <w:r>
+              <w:rPr>
+                <w:sz w:val="20"/>
+                <w:szCs w:val="20"/>
+              </w:rPr>
+              <w:t>{check_</w:t>
+            </w:r>
+            <w:r>
+              <w:rPr>
+                <w:sz w:val="20"/>
+                <w:szCs w:val="20"/>
+              </w:rPr>
+              <w:t>did</w:t>
+            </w:r>
+            <w:r>
+              <w:rPr>
+                <w:sz w:val="20"/>
+                <w:szCs w:val="20"/>
+              </w:rPr>
+              <w:t xml:space="preserve">} </w:t>
+            </w:r>
+            <w:r>
+              <w:rPr>
+                <w:sz w:val="20"/>
+                <w:szCs w:val="20"/>
+              </w:rPr>
+              <w:t>DID</w:t>
+            </w:r>
+          </w:p>
+        </w:tc>
+        <w:tc>
+          <w:tcPr>
+            <w:tcW w:w="2980" w:type="dxa"/>
+          </w:tcPr>
+          <w:p>
+            <w:pPr>
+              <w:rPr>
+                <w:sz w:val="20"/>
+                <w:szCs w:val="20"/>
+              </w:rPr>
+            </w:pPr>
+            <w:r>
+              <w:rPr>
+                <w:sz w:val="20"/>
+                <w:szCs w:val="20"/>
+              </w:rPr>
+              <w:t>{check_</w:t>
+            </w:r>
+            <w:r>
+              <w:rPr>
+                <w:sz w:val="20"/>
+                <w:szCs w:val="20"/>
+              </w:rPr>
+              <w:t>pad</w:t>
+            </w:r>
+            <w:r>
+              <w:rPr>
+                <w:sz w:val="20"/>
+                <w:szCs w:val="20"/>
+              </w:rPr>
+              <w:t xml:space="preserve">} </w:t>
+            </w:r>
+            <w:r>
+              <w:rPr>
+                <w:sz w:val="20"/>
+                <w:szCs w:val="20"/>
+              </w:rPr>
+              <w:t>PAD</w:t>
+            </w:r>
+          </w:p>
+        </w:tc>
+      </w:tr>
+      <w:tr>
+        <w:tc>
+          <w:tcPr>
+            <w:tcW w:w="3539" w:type="dxa"/>
+          </w:tcPr>
+          <w:p>
+            <w:pPr>
+              <w:rPr>
+                <w:sz w:val="20"/>
+                <w:szCs w:val="20"/>
+              </w:rPr>
+            </w:pPr>
+          </w:p>
+        </w:tc>
+        <w:tc>
+          <w:tcPr>
+            <w:tcW w:w="2693" w:type="dxa"/>
+          </w:tcPr>
+          <w:p>
+            <w:pPr>
+              <w:rPr>
+                <w:sz w:val="20"/>
+                <w:szCs w:val="20"/>
+              </w:rPr>
+            </w:pPr>
+            <w:r>
+              <w:rPr>
+                <w:sz w:val="20"/>
+                <w:szCs w:val="20"/>
+              </w:rPr>
+              <w:t xml:space="preserve">{check_banprov} </w:t>
+            </w:r>
+            <w:r>
+              <w:rPr>
+                <w:sz w:val="20"/>
+                <w:szCs w:val="20"/>
+              </w:rPr>
+              <w:t>Bantuan Provinsi</w:t>
+            </w:r>
+          </w:p>
+        </w:tc>
+        <w:tc>
+          <w:tcPr>
+            <w:tcW w:w="2980" w:type="dxa"/>
+          </w:tcPr>
+          <w:p>
+            <w:pPr>
+              <w:rPr>
+                <w:sz w:val="20"/>
+                <w:szCs w:val="20"/>
+              </w:rPr>
+            </w:pPr>
+            <w:r>
+              <w:rPr>
+                <w:sz w:val="20"/>
+                <w:szCs w:val="20"/>
+              </w:rPr>
+              <w:t>{check_</w:t>
+            </w:r>
+            <w:r>
+              <w:rPr>
+                <w:sz w:val="20"/>
+                <w:szCs w:val="20"/>
+              </w:rPr>
+              <w:t>dbhct</w:t>
+            </w:r>
+            <w:r>
+              <w:rPr>
+                <w:sz w:val="20"/>
+                <w:szCs w:val="20"/>
+              </w:rPr>
+              <w:t xml:space="preserve">} </w:t>
+            </w:r>
+            <w:r>
+              <w:rPr>
+                <w:sz w:val="20"/>
+                <w:szCs w:val="20"/>
+              </w:rPr>
+              <w:t>DBHCT</w:t>
+            </w:r>
+          </w:p>
+        </w:tc>
+      </w:tr>
+      <w:tr>
+        <w:tc>
+          <w:tcPr>
+            <w:tcW w:w="3539" w:type="dxa"/>
+          </w:tcPr>
+          <w:p>
+            <w:pPr>
+              <w:rPr>
+                <w:sz w:val="20"/>
+                <w:szCs w:val="20"/>
+              </w:rPr>
+            </w:pPr>
+          </w:p>
+        </w:tc>
+        <w:tc>
+          <w:tcPr>
+            <w:tcW w:w="2693" w:type="dxa"/>
+          </w:tcPr>
+          <w:p>
+            <w:pPr>
+              <w:rPr>
+                <w:sz w:val="20"/>
+                <w:szCs w:val="20"/>
+              </w:rPr>
+            </w:pPr>
+            <w:r>
+              <w:rPr>
+                <w:sz w:val="20"/>
+                <w:szCs w:val="20"/>
+              </w:rPr>
+              <w:t>{check_</w:t>
+            </w:r>
+            <w:r>
+              <w:rPr>
+                <w:sz w:val="20"/>
+                <w:szCs w:val="20"/>
+              </w:rPr>
+              <w:t>dbh</w:t>
+            </w:r>
+            <w:r>
+              <w:rPr>
+                <w:sz w:val="20"/>
+                <w:szCs w:val="20"/>
+              </w:rPr>
+              <w:t xml:space="preserve">} </w:t>
+            </w:r>
+            <w:r>
+              <w:rPr>
+                <w:sz w:val="20"/>
+                <w:szCs w:val="20"/>
+              </w:rPr>
+              <w:t>DBH</w:t>
+            </w:r>
+            <w:r>
+              <w:rPr>
+                <w:sz w:val="20"/>
+                <w:szCs w:val="20"/>
+              </w:rPr>
+              <w:t xml:space="preserve"> </w:t>
+            </w:r>
+          </w:p>
+        </w:tc>
+        <w:tc>
+          <w:tcPr>
+            <w:tcW w:w="2980" w:type="dxa"/>
+          </w:tcPr>
+          <w:p>
+            <w:pPr>
+              <w:rPr>
+                <w:sz w:val="20"/>
+                <w:szCs w:val="20"/>
+              </w:rPr>
+            </w:pPr>
+            <w:r>
+              <w:rPr>
+                <w:sz w:val="20"/>
+                <w:szCs w:val="20"/>
+              </w:rPr>
+              <w:t>{check_</w:t>
+            </w:r>
+            <w:r>
+              <w:rPr>
+                <w:sz w:val="20"/>
+                <w:szCs w:val="20"/>
+              </w:rPr>
+              <w:t>dbh_prov</w:t>
+            </w:r>
+            <w:r>
+              <w:rPr>
+                <w:sz w:val="20"/>
+                <w:szCs w:val="20"/>
+              </w:rPr>
+              <w:t xml:space="preserve">} </w:t>
+            </w:r>
+            <w:r>
+              <w:rPr>
+                <w:sz w:val="20"/>
+                <w:szCs w:val="20"/>
+              </w:rPr>
+              <w:t>DBH Prov</w:t>
+            </w:r>
+          </w:p>
+        </w:tc>
+      </w:tr>
+    </w:tbl>
+    <w:p>
+      <w:pPr>
+        <w:rPr>
+          <w:sz w:val="20"/>
+          <w:szCs w:val="20"/>
         </w:rPr>
       </w:pPr>
     </w:p>
     <w:p>
       <w:pPr>
-        <w:jc w:val="center"/>
         <w:rPr>
-          <w:b/>
-          <w:bCs/>
           <w:sz w:val="20"/>
           <w:szCs w:val="20"/>
-          <w:u w:val="single"/>
-        </w:rPr>
-      </w:pPr>
-    </w:p>
-    <w:p>
-      <w:pPr>
-        <w:jc w:val="center"/>
-        <w:rPr>
-          <w:b/>
-          <w:bCs/>
-          <w:sz w:val="20"/>
-          <w:szCs w:val="20"/>
-          <w:u w:val="single"/>
         </w:rPr>
       </w:pPr>
     </w:p>
@@ -1289,6 +635,13 @@
                 <w:sz w:val="20"/>
                 <w:szCs w:val="20"/>
               </w:rPr>
+              <w:t xml:space="preserve">  </w:t>
+            </w:r>
+            <w:r>
+              <w:rPr>
+                <w:sz w:val="20"/>
+                <w:szCs w:val="20"/>
+              </w:rPr>
               <w:t>1</w:t>
             </w:r>
           </w:p>
@@ -1681,21 +1034,7 @@
                 <w:sz w:val="20"/>
                 <w:szCs w:val="20"/>
               </w:rPr>
-              <w:t>{nama_</w:t>
-            </w:r>
-            <w:r>
-              <w:rPr>
-                <w:sz w:val="20"/>
-                <w:szCs w:val="20"/>
-              </w:rPr>
-              <w:t>kegiatan</w:t>
-            </w:r>
-            <w:r>
-              <w:rPr>
-                <w:sz w:val="20"/>
-                <w:szCs w:val="20"/>
-              </w:rPr>
-              <w:t>}</w:t>
+              <w:t>{nama_kegiatan}</w:t>
             </w:r>
           </w:p>
         </w:tc>
@@ -1778,21 +1117,7 @@
                 <w:sz w:val="20"/>
                 <w:szCs w:val="20"/>
               </w:rPr>
-              <w:t>{nama_</w:t>
-            </w:r>
-            <w:r>
-              <w:rPr>
-                <w:sz w:val="20"/>
-                <w:szCs w:val="20"/>
-              </w:rPr>
-              <w:t>subkegiatan</w:t>
-            </w:r>
-            <w:r>
-              <w:rPr>
-                <w:sz w:val="20"/>
-                <w:szCs w:val="20"/>
-              </w:rPr>
-              <w:t>}</w:t>
+              <w:t>{nama_subkegiatan}</w:t>
             </w:r>
           </w:p>
         </w:tc>
@@ -1875,21 +1200,7 @@
                 <w:sz w:val="20"/>
                 <w:szCs w:val="20"/>
               </w:rPr>
-              <w:t>{</w:t>
-            </w:r>
-            <w:r>
-              <w:rPr>
-                <w:sz w:val="20"/>
-                <w:szCs w:val="20"/>
-              </w:rPr>
-              <w:t>kode_rekening</w:t>
-            </w:r>
-            <w:r>
-              <w:rPr>
-                <w:sz w:val="20"/>
-                <w:szCs w:val="20"/>
-              </w:rPr>
-              <w:t>}</w:t>
+              <w:t>{kode_rekening}</w:t>
             </w:r>
           </w:p>
         </w:tc>
@@ -2221,35 +1532,7 @@
                 <w:sz w:val="20"/>
                 <w:szCs w:val="20"/>
               </w:rPr>
-              <w:t>{nomor_spk</w:t>
-            </w:r>
-            <w:r>
-              <w:rPr>
-                <w:sz w:val="20"/>
-                <w:szCs w:val="20"/>
-              </w:rPr>
-              <w:t>_addendum1</w:t>
-            </w:r>
-            <w:r>
-              <w:rPr>
-                <w:sz w:val="20"/>
-                <w:szCs w:val="20"/>
-              </w:rPr>
-              <w:t>} {tgl_spk</w:t>
-            </w:r>
-            <w:r>
-              <w:rPr>
-                <w:sz w:val="20"/>
-                <w:szCs w:val="20"/>
-              </w:rPr>
-              <w:t>_addendum1</w:t>
-            </w:r>
-            <w:r>
-              <w:rPr>
-                <w:sz w:val="20"/>
-                <w:szCs w:val="20"/>
-              </w:rPr>
-              <w:t>}</w:t>
+              <w:t>{nomor_addendum1} {tgl_addendum1}</w:t>
             </w:r>
           </w:p>
         </w:tc>
@@ -3255,21 +2538,7 @@
                 <w:sz w:val="20"/>
                 <w:szCs w:val="20"/>
               </w:rPr>
-              <w:t>Denda merupakan sanksi finansial yang dikenakan kepada Penyedia, sedangkan ganti rugi merupakan</w:t>
-            </w:r>
-            <w:r>
-              <w:rPr>
-                <w:sz w:val="20"/>
-                <w:szCs w:val="20"/>
-              </w:rPr>
-              <w:t xml:space="preserve"> </w:t>
-            </w:r>
-            <w:r>
-              <w:rPr>
-                <w:sz w:val="20"/>
-                <w:szCs w:val="20"/>
-              </w:rPr>
-              <w:t>sanksi finasial yang dikenakan kepada PPK, karena terjadinya cedra janji/wanperstasi yang tercantum dalam kontrak</w:t>
+              <w:t>Denda merupakan sanksi finansial yang dikenakan kepada Penyedia, sedangkan ganti rugi merupakan sanksi finasial yang dikenakan kepada PPK, karena terjadinya cedra janji/wanperstasi yang tercantum dalam kontrak</w:t>
             </w:r>
           </w:p>
           <w:p>
@@ -4384,35 +3653,7 @@
           <w:sz w:val="20"/>
           <w:szCs w:val="20"/>
         </w:rPr>
-        <w:t>Pada</w:t>
-      </w:r>
-      <w:r>
-        <w:rPr>
-          <w:sz w:val="20"/>
-          <w:szCs w:val="20"/>
-        </w:rPr>
-        <w:t xml:space="preserve"> Hari ini,</w:t>
-      </w:r>
-      <w:r>
-        <w:rPr>
-          <w:sz w:val="20"/>
-          <w:szCs w:val="20"/>
-        </w:rPr>
-        <w:t xml:space="preserve"> </w:t>
-      </w:r>
-      <w:r>
-        <w:rPr>
-          <w:sz w:val="20"/>
-          <w:szCs w:val="20"/>
-        </w:rPr>
-        <w:t>{tgl_ringkasan}</w:t>
-      </w:r>
-      <w:r>
-        <w:rPr>
-          <w:sz w:val="20"/>
-          <w:szCs w:val="20"/>
-        </w:rPr>
-        <w:t xml:space="preserve"> Tahun Dua Ribu Dua Puluh Enam Bertempatan di Cianjur ,yang bertandatangan dibawah ini:</w:t>
+        <w:t>Pada Hari ini, {tgl_ringkasan} Tahun Dua Ribu Dua Puluh Enam Bertempatan di Cianjur ,yang bertandatangan dibawah ini:</w:t>
       </w:r>
     </w:p>
     <w:p>
@@ -7068,6 +6309,7 @@
   <w:style w:type="character" w:default="1" w:styleId="DefaultParagraphFont">
     <w:name w:val="Default Paragraph Font"/>
     <w:uiPriority w:val="1"/>
+    <w:semiHidden/>
     <w:unhideWhenUsed/>
   </w:style>
   <w:style w:type="table" w:default="1" w:styleId="TableNormal">

</xml_diff>